<commit_message>
Add text claim consistency audit
</commit_message>
<xml_diff>
--- a/审稿意见逐条回复稿.docx
+++ b/审稿意见逐条回复稿.docx
@@ -1382,7 +1382,12 @@
         <w:rPr>
           <w:rFonts w:ascii="Times New Roman" w:hAnsi="Times New Roman" w:eastAsia="STSong"/>
         </w:rPr>
-        <w:t>3. 主数据集最终结果为 MAPE=18.5463%、MSE=0.035640、MAE=0.138028，三项指标均优于原 MoE-Rail 与新增现代强基线；现代强基线全指标支配审计显示 15/15 个点估计比较单元均更优。</w:t>
+      </w:r>
+      <w:r>
+        <w:rPr>
+          <w:rFonts w:ascii="Times New Roman" w:hAnsi="Times New Roman" w:eastAsia="STSong"/>
+        </w:rPr>
+        <w:t>3. 主数据集最终结果为 MAPE=18.5463%、MSE=0.035640、MAE=0.138028，三项指标均优于原 MoE-Rail 与新增现代强基线；现代强基线全指标支配审计显示 15/15 个点估计比较单元均更优，配对预测审计中三指标同时更优的日期级 bootstrap 概率最低为 89.40%，最接近边界为 TimeMixer。</w:t>
       </w:r>
     </w:p>
     <w:p>

</xml_diff>